<commit_message>
feat(notification): implement dual debit/credit email advice architecture and update technical showcase docx
</commit_message>
<xml_diff>
--- a/docs/Notification_Service_Comprehensive_Documentation.docx
+++ b/docs/Notification_Service_Comprehensive_Documentation.docx
@@ -27,11 +27,11 @@
           <w:rFonts w:ascii="Calibri" w:hAnsi="Calibri"/>
           <w:b/>
           <w:color w:val="0F172A"/>
-          <w:sz w:val="40"/>
+          <w:sz w:val="38"/>
         </w:rPr>
         <w:t>Notification &amp; Alert Microservice (:8083)</w:t>
         <w:br/>
-        <w:t>Comprehensive Technical Documentation &amp; Showcase Guide</w:t>
+        <w:t>Technical Documentation &amp; Showcase Playbook</w:t>
       </w:r>
     </w:p>
     <w:p>
@@ -44,9 +44,9 @@
           <w:rFonts w:ascii="Calibri" w:hAnsi="Calibri"/>
           <w:i/>
           <w:color w:val="334155"/>
-          <w:sz w:val="21"/>
+          <w:sz w:val="20"/>
         </w:rPr>
-        <w:t>Pure Online Banking Architecture, Maker-Checker Matrix, BSP MORB &amp; AMLA Statutory Playbook</w:t>
+        <w:t>Pure Online Banking Architecture • Dual Debit/Credit Advice Architecture • BSP MORB &amp; AMLA Matrix</w:t>
         <w:br/>
         <w:t>Group 3 — Full Stack Engineering (FSE) Capstone Project</w:t>
       </w:r>
@@ -60,7 +60,7 @@
           <w:rFonts w:ascii="Calibri" w:hAnsi="Calibri"/>
           <w:b/>
           <w:color w:val="0E7490"/>
-          <w:sz w:val="28"/>
+          <w:sz w:val="27"/>
         </w:rPr>
         <w:t>1. Architectural Overview &amp; Pure Online Banking Paradigm</w:t>
       </w:r>
@@ -73,7 +73,7 @@
         <w:rPr>
           <w:rFonts w:ascii="Calibri" w:hAnsi="Calibri"/>
           <w:color w:val="334155"/>
-          <w:sz w:val="20"/>
+          <w:sz w:val="19"/>
         </w:rPr>
         <w:t>The Notification &amp; Alert Microservice (running on port :8083) is an asynchronous, event-driven Spring Boot 3.3.x engine designed in strict accordance with the Bangko Sentral ng Pilipinas (BSP) Manual of Regulations for Banks (MORB) and the Anti-Money Laundering Act (RA 9160).</w:t>
       </w:r>
@@ -86,9 +86,80 @@
         <w:rPr>
           <w:rFonts w:ascii="Calibri" w:hAnsi="Calibri"/>
           <w:color w:val="334155"/>
-          <w:sz w:val="20"/>
+          <w:sz w:val="19"/>
         </w:rPr>
         <w:t>In this Pure Retail Online Banking architecture, the Customer operates as the Maker via the client web portal. Branch tellers are eliminated for digital retail fund transfers. Transfers requiring operational oversight (amounts exceeding PHP 50,000.00) are routed directly to Bank Operations Managers via WebSocket push notifications and actionable compliance emails.</w:t>
+      </w:r>
+    </w:p>
+    <w:p>
+      <w:pPr>
+        <w:spacing w:before="200" w:after="60"/>
+      </w:pPr>
+      <w:r>
+        <w:rPr>
+          <w:rFonts w:ascii="Calibri" w:hAnsi="Calibri"/>
+          <w:b/>
+          <w:color w:val="0F172A"/>
+          <w:sz w:val="23"/>
+        </w:rPr>
+        <w:t>Dual Email Architecture: Debit Advice (Sender) vs. Credit Advice (Beneficiary)</w:t>
+      </w:r>
+    </w:p>
+    <w:p>
+      <w:pPr>
+        <w:spacing w:after="60" w:line="276" w:lineRule="auto"/>
+      </w:pPr>
+      <w:r>
+        <w:rPr>
+          <w:rFonts w:ascii="Calibri" w:hAnsi="Calibri"/>
+          <w:color w:val="334155"/>
+          <w:sz w:val="19"/>
+        </w:rPr>
+        <w:t>A fundamental tenet of retail banking (BSP Circular 980 &amp; 1033) and the Data Privacy Act of 2012 (RA 10173) is that the two counter-parties in a fund transfer must receive distinct and asymmetric transaction notifications:</w:t>
+      </w:r>
+    </w:p>
+    <w:p>
+      <w:pPr>
+        <w:spacing w:after="60" w:line="276" w:lineRule="auto"/>
+      </w:pPr>
+      <w:r>
+        <w:rPr>
+          <w:rFonts w:ascii="Calibri" w:hAnsi="Calibri"/>
+          <w:b/>
+          <w:color w:val="0F172A"/>
+          <w:sz w:val="19"/>
+        </w:rPr>
+        <w:t xml:space="preserve">1. Sender Debit Advice (Transaction Receipt): </w:t>
+      </w:r>
+      <w:r>
+        <w:rPr>
+          <w:rFonts w:ascii="Calibri" w:hAnsi="Calibri"/>
+          <w:color w:val="334155"/>
+          <w:sz w:val="19"/>
+        </w:rPr>
+        <w:t xml:space="preserve"> Sent to the initiating customer (Juan Dela Cruz). Explicitly details the amount debited (-₱7,500.00), the masked recipient account (ACC-****7192), the transaction reference, and the sender's remaining account balance. Serves as legal proof of payment.</w:t>
+      </w:r>
+    </w:p>
+    <w:p>
+      <w:pPr>
+        <w:spacing w:after="60" w:line="276" w:lineRule="auto"/>
+      </w:pPr>
+      <w:r>
+        <w:rPr>
+          <w:rFonts w:ascii="Calibri" w:hAnsi="Calibri"/>
+          <w:b/>
+          <w:color w:val="0F172A"/>
+          <w:sz w:val="19"/>
+        </w:rPr>
+        <w:t xml:space="preserve">2. Beneficiary Inward Credit Advice: </w:t>
+      </w:r>
+      <w:r>
+        <w:rPr>
+          <w:rFonts w:ascii="Calibri" w:hAnsi="Calibri"/>
+          <w:color w:val="334155"/>
+          <w:sz w:val="19"/>
+        </w:rPr>
+        <w:t xml:space="preserve"> Sent to the receiving beneficiary (Maria Santos). Confirms inward funds credited (+₱7,500.00), shows the sender's masked origin (ACC-****8471), and confirms cleared availability. To comply with RA 10173, the sender's private bank balance is strictly suppressed and never exposed.</w:t>
       </w:r>
     </w:p>
     <w:p>
@@ -100,7 +171,7 @@
           <w:rFonts w:ascii="Calibri" w:hAnsi="Calibri"/>
           <w:b/>
           <w:color w:val="0E7490"/>
-          <w:sz w:val="28"/>
+          <w:sz w:val="27"/>
         </w:rPr>
         <w:t>2. System Actors &amp; Segregation of Duties (SoD) Directory</w:t>
       </w:r>
@@ -112,16 +183,16 @@
         <w:tblLook w:firstColumn="1" w:firstRow="1" w:lastColumn="0" w:lastRow="0" w:noHBand="0" w:noVBand="1" w:val="04A0"/>
       </w:tblPr>
       <w:tblGrid>
-        <w:gridCol w:w="1987"/>
-        <w:gridCol w:w="1987"/>
-        <w:gridCol w:w="1987"/>
-        <w:gridCol w:w="1987"/>
-        <w:gridCol w:w="1987"/>
+        <w:gridCol w:w="2016"/>
+        <w:gridCol w:w="2016"/>
+        <w:gridCol w:w="2016"/>
+        <w:gridCol w:w="2016"/>
+        <w:gridCol w:w="2016"/>
       </w:tblGrid>
       <w:tr>
         <w:tc>
           <w:tcPr>
-            <w:tcW w:type="dxa" w:w="1987"/>
+            <w:tcW w:type="dxa" w:w="2016"/>
             <w:shd w:fill="0F172A"/>
             <w:tcMar>
               <w:top w:w="100" w:type="dxa"/>
@@ -143,7 +214,7 @@
         </w:tc>
         <w:tc>
           <w:tcPr>
-            <w:tcW w:type="dxa" w:w="1987"/>
+            <w:tcW w:type="dxa" w:w="2016"/>
             <w:shd w:fill="0F172A"/>
             <w:tcMar>
               <w:top w:w="100" w:type="dxa"/>
@@ -165,7 +236,7 @@
         </w:tc>
         <w:tc>
           <w:tcPr>
-            <w:tcW w:type="dxa" w:w="1987"/>
+            <w:tcW w:type="dxa" w:w="2016"/>
             <w:shd w:fill="0F172A"/>
             <w:tcMar>
               <w:top w:w="100" w:type="dxa"/>
@@ -187,7 +258,7 @@
         </w:tc>
         <w:tc>
           <w:tcPr>
-            <w:tcW w:type="dxa" w:w="1987"/>
+            <w:tcW w:type="dxa" w:w="2016"/>
             <w:shd w:fill="0F172A"/>
             <w:tcMar>
               <w:top w:w="100" w:type="dxa"/>
@@ -209,7 +280,7 @@
         </w:tc>
         <w:tc>
           <w:tcPr>
-            <w:tcW w:type="dxa" w:w="1987"/>
+            <w:tcW w:type="dxa" w:w="2016"/>
             <w:shd w:fill="0F172A"/>
             <w:tcMar>
               <w:top w:w="100" w:type="dxa"/>
@@ -233,7 +304,7 @@
       <w:tr>
         <w:tc>
           <w:tcPr>
-            <w:tcW w:type="dxa" w:w="1987"/>
+            <w:tcW w:type="dxa" w:w="2016"/>
             <w:tcMar>
               <w:top w:w="70" w:type="dxa"/>
               <w:bottom w:w="70" w:type="dxa"/>
@@ -253,7 +324,7 @@
         </w:tc>
         <w:tc>
           <w:tcPr>
-            <w:tcW w:type="dxa" w:w="1987"/>
+            <w:tcW w:type="dxa" w:w="2016"/>
             <w:tcMar>
               <w:top w:w="70" w:type="dxa"/>
               <w:bottom w:w="70" w:type="dxa"/>
@@ -273,7 +344,7 @@
         </w:tc>
         <w:tc>
           <w:tcPr>
-            <w:tcW w:type="dxa" w:w="1987"/>
+            <w:tcW w:type="dxa" w:w="2016"/>
             <w:tcMar>
               <w:top w:w="70" w:type="dxa"/>
               <w:bottom w:w="70" w:type="dxa"/>
@@ -293,7 +364,7 @@
         </w:tc>
         <w:tc>
           <w:tcPr>
-            <w:tcW w:type="dxa" w:w="1987"/>
+            <w:tcW w:type="dxa" w:w="2016"/>
             <w:tcMar>
               <w:top w:w="70" w:type="dxa"/>
               <w:bottom w:w="70" w:type="dxa"/>
@@ -313,7 +384,7 @@
         </w:tc>
         <w:tc>
           <w:tcPr>
-            <w:tcW w:type="dxa" w:w="1987"/>
+            <w:tcW w:type="dxa" w:w="2016"/>
             <w:tcMar>
               <w:top w:w="70" w:type="dxa"/>
               <w:bottom w:w="70" w:type="dxa"/>
@@ -335,7 +406,7 @@
       <w:tr>
         <w:tc>
           <w:tcPr>
-            <w:tcW w:type="dxa" w:w="1987"/>
+            <w:tcW w:type="dxa" w:w="2016"/>
             <w:tcMar>
               <w:top w:w="70" w:type="dxa"/>
               <w:bottom w:w="70" w:type="dxa"/>
@@ -356,7 +427,7 @@
         </w:tc>
         <w:tc>
           <w:tcPr>
-            <w:tcW w:type="dxa" w:w="1987"/>
+            <w:tcW w:type="dxa" w:w="2016"/>
             <w:tcMar>
               <w:top w:w="70" w:type="dxa"/>
               <w:bottom w:w="70" w:type="dxa"/>
@@ -377,7 +448,7 @@
         </w:tc>
         <w:tc>
           <w:tcPr>
-            <w:tcW w:type="dxa" w:w="1987"/>
+            <w:tcW w:type="dxa" w:w="2016"/>
             <w:tcMar>
               <w:top w:w="70" w:type="dxa"/>
               <w:bottom w:w="70" w:type="dxa"/>
@@ -398,7 +469,7 @@
         </w:tc>
         <w:tc>
           <w:tcPr>
-            <w:tcW w:type="dxa" w:w="1987"/>
+            <w:tcW w:type="dxa" w:w="2016"/>
             <w:tcMar>
               <w:top w:w="70" w:type="dxa"/>
               <w:bottom w:w="70" w:type="dxa"/>
@@ -419,7 +490,7 @@
         </w:tc>
         <w:tc>
           <w:tcPr>
-            <w:tcW w:type="dxa" w:w="1987"/>
+            <w:tcW w:type="dxa" w:w="2016"/>
             <w:tcMar>
               <w:top w:w="70" w:type="dxa"/>
               <w:bottom w:w="70" w:type="dxa"/>
@@ -442,7 +513,7 @@
       <w:tr>
         <w:tc>
           <w:tcPr>
-            <w:tcW w:type="dxa" w:w="1987"/>
+            <w:tcW w:type="dxa" w:w="2016"/>
             <w:tcMar>
               <w:top w:w="70" w:type="dxa"/>
               <w:bottom w:w="70" w:type="dxa"/>
@@ -462,7 +533,7 @@
         </w:tc>
         <w:tc>
           <w:tcPr>
-            <w:tcW w:type="dxa" w:w="1987"/>
+            <w:tcW w:type="dxa" w:w="2016"/>
             <w:tcMar>
               <w:top w:w="70" w:type="dxa"/>
               <w:bottom w:w="70" w:type="dxa"/>
@@ -482,7 +553,7 @@
         </w:tc>
         <w:tc>
           <w:tcPr>
-            <w:tcW w:type="dxa" w:w="1987"/>
+            <w:tcW w:type="dxa" w:w="2016"/>
             <w:tcMar>
               <w:top w:w="70" w:type="dxa"/>
               <w:bottom w:w="70" w:type="dxa"/>
@@ -502,7 +573,7 @@
         </w:tc>
         <w:tc>
           <w:tcPr>
-            <w:tcW w:type="dxa" w:w="1987"/>
+            <w:tcW w:type="dxa" w:w="2016"/>
             <w:tcMar>
               <w:top w:w="70" w:type="dxa"/>
               <w:bottom w:w="70" w:type="dxa"/>
@@ -522,7 +593,7 @@
         </w:tc>
         <w:tc>
           <w:tcPr>
-            <w:tcW w:type="dxa" w:w="1987"/>
+            <w:tcW w:type="dxa" w:w="2016"/>
             <w:tcMar>
               <w:top w:w="70" w:type="dxa"/>
               <w:bottom w:w="70" w:type="dxa"/>
@@ -544,7 +615,7 @@
       <w:tr>
         <w:tc>
           <w:tcPr>
-            <w:tcW w:type="dxa" w:w="1987"/>
+            <w:tcW w:type="dxa" w:w="2016"/>
             <w:tcMar>
               <w:top w:w="70" w:type="dxa"/>
               <w:bottom w:w="70" w:type="dxa"/>
@@ -565,7 +636,7 @@
         </w:tc>
         <w:tc>
           <w:tcPr>
-            <w:tcW w:type="dxa" w:w="1987"/>
+            <w:tcW w:type="dxa" w:w="2016"/>
             <w:tcMar>
               <w:top w:w="70" w:type="dxa"/>
               <w:bottom w:w="70" w:type="dxa"/>
@@ -586,7 +657,7 @@
         </w:tc>
         <w:tc>
           <w:tcPr>
-            <w:tcW w:type="dxa" w:w="1987"/>
+            <w:tcW w:type="dxa" w:w="2016"/>
             <w:tcMar>
               <w:top w:w="70" w:type="dxa"/>
               <w:bottom w:w="70" w:type="dxa"/>
@@ -607,7 +678,7 @@
         </w:tc>
         <w:tc>
           <w:tcPr>
-            <w:tcW w:type="dxa" w:w="1987"/>
+            <w:tcW w:type="dxa" w:w="2016"/>
             <w:tcMar>
               <w:top w:w="70" w:type="dxa"/>
               <w:bottom w:w="70" w:type="dxa"/>
@@ -628,7 +699,7 @@
         </w:tc>
         <w:tc>
           <w:tcPr>
-            <w:tcW w:type="dxa" w:w="1987"/>
+            <w:tcW w:type="dxa" w:w="2016"/>
             <w:tcMar>
               <w:top w:w="70" w:type="dxa"/>
               <w:bottom w:w="70" w:type="dxa"/>
@@ -651,7 +722,7 @@
       <w:tr>
         <w:tc>
           <w:tcPr>
-            <w:tcW w:type="dxa" w:w="1987"/>
+            <w:tcW w:type="dxa" w:w="2016"/>
             <w:tcMar>
               <w:top w:w="70" w:type="dxa"/>
               <w:bottom w:w="70" w:type="dxa"/>
@@ -671,7 +742,7 @@
         </w:tc>
         <w:tc>
           <w:tcPr>
-            <w:tcW w:type="dxa" w:w="1987"/>
+            <w:tcW w:type="dxa" w:w="2016"/>
             <w:tcMar>
               <w:top w:w="70" w:type="dxa"/>
               <w:bottom w:w="70" w:type="dxa"/>
@@ -691,7 +762,7 @@
         </w:tc>
         <w:tc>
           <w:tcPr>
-            <w:tcW w:type="dxa" w:w="1987"/>
+            <w:tcW w:type="dxa" w:w="2016"/>
             <w:tcMar>
               <w:top w:w="70" w:type="dxa"/>
               <w:bottom w:w="70" w:type="dxa"/>
@@ -711,7 +782,7 @@
         </w:tc>
         <w:tc>
           <w:tcPr>
-            <w:tcW w:type="dxa" w:w="1987"/>
+            <w:tcW w:type="dxa" w:w="2016"/>
             <w:tcMar>
               <w:top w:w="70" w:type="dxa"/>
               <w:bottom w:w="70" w:type="dxa"/>
@@ -731,7 +802,7 @@
         </w:tc>
         <w:tc>
           <w:tcPr>
-            <w:tcW w:type="dxa" w:w="1987"/>
+            <w:tcW w:type="dxa" w:w="2016"/>
             <w:tcMar>
               <w:top w:w="70" w:type="dxa"/>
               <w:bottom w:w="70" w:type="dxa"/>
@@ -765,7 +836,7 @@
           <w:rFonts w:ascii="Calibri" w:hAnsi="Calibri"/>
           <w:b/>
           <w:color w:val="0E7490"/>
-          <w:sz w:val="28"/>
+          <w:sz w:val="27"/>
         </w:rPr>
         <w:t>3. Comprehensive Notification Scenarios Master Matrix</w:t>
       </w:r>
@@ -778,7 +849,7 @@
         <w:rPr>
           <w:rFonts w:ascii="Calibri" w:hAnsi="Calibri"/>
           <w:color w:val="334155"/>
-          <w:sz w:val="20"/>
+          <w:sz w:val="19"/>
         </w:rPr>
         <w:t>The matrix below details all 10 distinct operational, technical, and regulatory scenarios implemented within the Notification Service, explicitly mapping actors, notification recipients, and legal mandates:</w:t>
       </w:r>
@@ -790,18 +861,18 @@
         <w:tblLook w:firstColumn="1" w:firstRow="1" w:lastColumn="0" w:lastRow="0" w:noHBand="0" w:noVBand="1" w:val="04A0"/>
       </w:tblPr>
       <w:tblGrid>
-        <w:gridCol w:w="1419"/>
-        <w:gridCol w:w="1419"/>
-        <w:gridCol w:w="1419"/>
-        <w:gridCol w:w="1419"/>
-        <w:gridCol w:w="1419"/>
-        <w:gridCol w:w="1419"/>
-        <w:gridCol w:w="1419"/>
+        <w:gridCol w:w="1440"/>
+        <w:gridCol w:w="1440"/>
+        <w:gridCol w:w="1440"/>
+        <w:gridCol w:w="1440"/>
+        <w:gridCol w:w="1440"/>
+        <w:gridCol w:w="1440"/>
+        <w:gridCol w:w="1440"/>
       </w:tblGrid>
       <w:tr>
         <w:tc>
           <w:tcPr>
-            <w:tcW w:type="dxa" w:w="1419"/>
+            <w:tcW w:type="dxa" w:w="1440"/>
             <w:shd w:fill="1E293B"/>
             <w:tcMar>
               <w:top w:w="100" w:type="dxa"/>
@@ -823,7 +894,7 @@
         </w:tc>
         <w:tc>
           <w:tcPr>
-            <w:tcW w:type="dxa" w:w="1419"/>
+            <w:tcW w:type="dxa" w:w="1440"/>
             <w:shd w:fill="1E293B"/>
             <w:tcMar>
               <w:top w:w="100" w:type="dxa"/>
@@ -845,7 +916,7 @@
         </w:tc>
         <w:tc>
           <w:tcPr>
-            <w:tcW w:type="dxa" w:w="1419"/>
+            <w:tcW w:type="dxa" w:w="1440"/>
             <w:shd w:fill="1E293B"/>
             <w:tcMar>
               <w:top w:w="100" w:type="dxa"/>
@@ -867,7 +938,7 @@
         </w:tc>
         <w:tc>
           <w:tcPr>
-            <w:tcW w:type="dxa" w:w="1419"/>
+            <w:tcW w:type="dxa" w:w="1440"/>
             <w:shd w:fill="1E293B"/>
             <w:tcMar>
               <w:top w:w="100" w:type="dxa"/>
@@ -889,7 +960,7 @@
         </w:tc>
         <w:tc>
           <w:tcPr>
-            <w:tcW w:type="dxa" w:w="1419"/>
+            <w:tcW w:type="dxa" w:w="1440"/>
             <w:shd w:fill="1E293B"/>
             <w:tcMar>
               <w:top w:w="100" w:type="dxa"/>
@@ -911,7 +982,7 @@
         </w:tc>
         <w:tc>
           <w:tcPr>
-            <w:tcW w:type="dxa" w:w="1419"/>
+            <w:tcW w:type="dxa" w:w="1440"/>
             <w:shd w:fill="1E293B"/>
             <w:tcMar>
               <w:top w:w="100" w:type="dxa"/>
@@ -933,7 +1004,7 @@
         </w:tc>
         <w:tc>
           <w:tcPr>
-            <w:tcW w:type="dxa" w:w="1419"/>
+            <w:tcW w:type="dxa" w:w="1440"/>
             <w:shd w:fill="1E293B"/>
             <w:tcMar>
               <w:top w:w="100" w:type="dxa"/>
@@ -957,7 +1028,7 @@
       <w:tr>
         <w:tc>
           <w:tcPr>
-            <w:tcW w:type="dxa" w:w="1419"/>
+            <w:tcW w:type="dxa" w:w="1440"/>
             <w:tcMar>
               <w:top w:w="60" w:type="dxa"/>
               <w:bottom w:w="60" w:type="dxa"/>
@@ -977,7 +1048,7 @@
         </w:tc>
         <w:tc>
           <w:tcPr>
-            <w:tcW w:type="dxa" w:w="1419"/>
+            <w:tcW w:type="dxa" w:w="1440"/>
             <w:tcMar>
               <w:top w:w="60" w:type="dxa"/>
               <w:bottom w:w="60" w:type="dxa"/>
@@ -997,7 +1068,7 @@
         </w:tc>
         <w:tc>
           <w:tcPr>
-            <w:tcW w:type="dxa" w:w="1419"/>
+            <w:tcW w:type="dxa" w:w="1440"/>
             <w:tcMar>
               <w:top w:w="60" w:type="dxa"/>
               <w:bottom w:w="60" w:type="dxa"/>
@@ -1017,7 +1088,7 @@
         </w:tc>
         <w:tc>
           <w:tcPr>
-            <w:tcW w:type="dxa" w:w="1419"/>
+            <w:tcW w:type="dxa" w:w="1440"/>
             <w:tcMar>
               <w:top w:w="60" w:type="dxa"/>
               <w:bottom w:w="60" w:type="dxa"/>
@@ -1037,7 +1108,7 @@
         </w:tc>
         <w:tc>
           <w:tcPr>
-            <w:tcW w:type="dxa" w:w="1419"/>
+            <w:tcW w:type="dxa" w:w="1440"/>
             <w:tcMar>
               <w:top w:w="60" w:type="dxa"/>
               <w:bottom w:w="60" w:type="dxa"/>
@@ -1051,15 +1122,15 @@
                 <w:color w:val="334155"/>
                 <w:sz w:val="16"/>
               </w:rPr>
-              <w:t>1. Juan Dela Cruz</w:t>
+              <w:t>1. Juan Dela Cruz (Debit)</w:t>
               <w:br/>
-              <w:t>2. Maria Santos</w:t>
+              <w:t>2. Maria Santos (Credit)</w:t>
             </w:r>
           </w:p>
         </w:tc>
         <w:tc>
           <w:tcPr>
-            <w:tcW w:type="dxa" w:w="1419"/>
+            <w:tcW w:type="dxa" w:w="1440"/>
             <w:tcMar>
               <w:top w:w="60" w:type="dxa"/>
               <w:bottom w:w="60" w:type="dxa"/>
@@ -1073,15 +1144,15 @@
                 <w:color w:val="334155"/>
                 <w:sz w:val="16"/>
               </w:rPr>
-              <w:t>Subject: Transaction Receipt: PHP 7,500.00</w:t>
+              <w:t>Sender: Transaction Receipt: P7,500.00</w:t>
               <w:br/>
-              <w:t>Body: Masked ACC-****8471, SHA-256 Hash.</w:t>
+              <w:t>Beneficiary: Credit Advice: You Received P7,500.00</w:t>
             </w:r>
           </w:p>
         </w:tc>
         <w:tc>
           <w:tcPr>
-            <w:tcW w:type="dxa" w:w="1419"/>
+            <w:tcW w:type="dxa" w:w="1440"/>
             <w:tcMar>
               <w:top w:w="60" w:type="dxa"/>
               <w:bottom w:w="60" w:type="dxa"/>
@@ -1099,7 +1170,7 @@
               <w:br/>
               <w:t>BSP Circular 1033</w:t>
               <w:br/>
-              <w:t>RA 10173 (Masking)</w:t>
+              <w:t>RA 10173 (Masking &amp; Privacy)</w:t>
             </w:r>
           </w:p>
         </w:tc>
@@ -1107,7 +1178,7 @@
       <w:tr>
         <w:tc>
           <w:tcPr>
-            <w:tcW w:type="dxa" w:w="1419"/>
+            <w:tcW w:type="dxa" w:w="1440"/>
             <w:tcMar>
               <w:top w:w="60" w:type="dxa"/>
               <w:bottom w:w="60" w:type="dxa"/>
@@ -1128,7 +1199,7 @@
         </w:tc>
         <w:tc>
           <w:tcPr>
-            <w:tcW w:type="dxa" w:w="1419"/>
+            <w:tcW w:type="dxa" w:w="1440"/>
             <w:tcMar>
               <w:top w:w="60" w:type="dxa"/>
               <w:bottom w:w="60" w:type="dxa"/>
@@ -1149,7 +1220,7 @@
         </w:tc>
         <w:tc>
           <w:tcPr>
-            <w:tcW w:type="dxa" w:w="1419"/>
+            <w:tcW w:type="dxa" w:w="1440"/>
             <w:tcMar>
               <w:top w:w="60" w:type="dxa"/>
               <w:bottom w:w="60" w:type="dxa"/>
@@ -1170,7 +1241,7 @@
         </w:tc>
         <w:tc>
           <w:tcPr>
-            <w:tcW w:type="dxa" w:w="1419"/>
+            <w:tcW w:type="dxa" w:w="1440"/>
             <w:tcMar>
               <w:top w:w="60" w:type="dxa"/>
               <w:bottom w:w="60" w:type="dxa"/>
@@ -1191,7 +1262,7 @@
         </w:tc>
         <w:tc>
           <w:tcPr>
-            <w:tcW w:type="dxa" w:w="1419"/>
+            <w:tcW w:type="dxa" w:w="1440"/>
             <w:tcMar>
               <w:top w:w="60" w:type="dxa"/>
               <w:bottom w:w="60" w:type="dxa"/>
@@ -1214,7 +1285,7 @@
         </w:tc>
         <w:tc>
           <w:tcPr>
-            <w:tcW w:type="dxa" w:w="1419"/>
+            <w:tcW w:type="dxa" w:w="1440"/>
             <w:tcMar>
               <w:top w:w="60" w:type="dxa"/>
               <w:bottom w:w="60" w:type="dxa"/>
@@ -1237,7 +1308,7 @@
         </w:tc>
         <w:tc>
           <w:tcPr>
-            <w:tcW w:type="dxa" w:w="1419"/>
+            <w:tcW w:type="dxa" w:w="1440"/>
             <w:tcMar>
               <w:top w:w="60" w:type="dxa"/>
               <w:bottom w:w="60" w:type="dxa"/>
@@ -1262,7 +1333,7 @@
       <w:tr>
         <w:tc>
           <w:tcPr>
-            <w:tcW w:type="dxa" w:w="1419"/>
+            <w:tcW w:type="dxa" w:w="1440"/>
             <w:tcMar>
               <w:top w:w="60" w:type="dxa"/>
               <w:bottom w:w="60" w:type="dxa"/>
@@ -1282,7 +1353,7 @@
         </w:tc>
         <w:tc>
           <w:tcPr>
-            <w:tcW w:type="dxa" w:w="1419"/>
+            <w:tcW w:type="dxa" w:w="1440"/>
             <w:tcMar>
               <w:top w:w="60" w:type="dxa"/>
               <w:bottom w:w="60" w:type="dxa"/>
@@ -1302,7 +1373,7 @@
         </w:tc>
         <w:tc>
           <w:tcPr>
-            <w:tcW w:type="dxa" w:w="1419"/>
+            <w:tcW w:type="dxa" w:w="1440"/>
             <w:tcMar>
               <w:top w:w="60" w:type="dxa"/>
               <w:bottom w:w="60" w:type="dxa"/>
@@ -1322,7 +1393,7 @@
         </w:tc>
         <w:tc>
           <w:tcPr>
-            <w:tcW w:type="dxa" w:w="1419"/>
+            <w:tcW w:type="dxa" w:w="1440"/>
             <w:tcMar>
               <w:top w:w="60" w:type="dxa"/>
               <w:bottom w:w="60" w:type="dxa"/>
@@ -1342,7 +1413,7 @@
         </w:tc>
         <w:tc>
           <w:tcPr>
-            <w:tcW w:type="dxa" w:w="1419"/>
+            <w:tcW w:type="dxa" w:w="1440"/>
             <w:tcMar>
               <w:top w:w="60" w:type="dxa"/>
               <w:bottom w:w="60" w:type="dxa"/>
@@ -1366,7 +1437,7 @@
         </w:tc>
         <w:tc>
           <w:tcPr>
-            <w:tcW w:type="dxa" w:w="1419"/>
+            <w:tcW w:type="dxa" w:w="1440"/>
             <w:tcMar>
               <w:top w:w="60" w:type="dxa"/>
               <w:bottom w:w="60" w:type="dxa"/>
@@ -1388,7 +1459,7 @@
         </w:tc>
         <w:tc>
           <w:tcPr>
-            <w:tcW w:type="dxa" w:w="1419"/>
+            <w:tcW w:type="dxa" w:w="1440"/>
             <w:tcMar>
               <w:top w:w="60" w:type="dxa"/>
               <w:bottom w:w="60" w:type="dxa"/>
@@ -1412,7 +1483,7 @@
       <w:tr>
         <w:tc>
           <w:tcPr>
-            <w:tcW w:type="dxa" w:w="1419"/>
+            <w:tcW w:type="dxa" w:w="1440"/>
             <w:tcMar>
               <w:top w:w="60" w:type="dxa"/>
               <w:bottom w:w="60" w:type="dxa"/>
@@ -1433,7 +1504,7 @@
         </w:tc>
         <w:tc>
           <w:tcPr>
-            <w:tcW w:type="dxa" w:w="1419"/>
+            <w:tcW w:type="dxa" w:w="1440"/>
             <w:tcMar>
               <w:top w:w="60" w:type="dxa"/>
               <w:bottom w:w="60" w:type="dxa"/>
@@ -1454,7 +1525,7 @@
         </w:tc>
         <w:tc>
           <w:tcPr>
-            <w:tcW w:type="dxa" w:w="1419"/>
+            <w:tcW w:type="dxa" w:w="1440"/>
             <w:tcMar>
               <w:top w:w="60" w:type="dxa"/>
               <w:bottom w:w="60" w:type="dxa"/>
@@ -1475,7 +1546,7 @@
         </w:tc>
         <w:tc>
           <w:tcPr>
-            <w:tcW w:type="dxa" w:w="1419"/>
+            <w:tcW w:type="dxa" w:w="1440"/>
             <w:tcMar>
               <w:top w:w="60" w:type="dxa"/>
               <w:bottom w:w="60" w:type="dxa"/>
@@ -1496,7 +1567,7 @@
         </w:tc>
         <w:tc>
           <w:tcPr>
-            <w:tcW w:type="dxa" w:w="1419"/>
+            <w:tcW w:type="dxa" w:w="1440"/>
             <w:tcMar>
               <w:top w:w="60" w:type="dxa"/>
               <w:bottom w:w="60" w:type="dxa"/>
@@ -1517,7 +1588,7 @@
         </w:tc>
         <w:tc>
           <w:tcPr>
-            <w:tcW w:type="dxa" w:w="1419"/>
+            <w:tcW w:type="dxa" w:w="1440"/>
             <w:tcMar>
               <w:top w:w="60" w:type="dxa"/>
               <w:bottom w:w="60" w:type="dxa"/>
@@ -1540,7 +1611,7 @@
         </w:tc>
         <w:tc>
           <w:tcPr>
-            <w:tcW w:type="dxa" w:w="1419"/>
+            <w:tcW w:type="dxa" w:w="1440"/>
             <w:tcMar>
               <w:top w:w="60" w:type="dxa"/>
               <w:bottom w:w="60" w:type="dxa"/>
@@ -1565,7 +1636,7 @@
       <w:tr>
         <w:tc>
           <w:tcPr>
-            <w:tcW w:type="dxa" w:w="1419"/>
+            <w:tcW w:type="dxa" w:w="1440"/>
             <w:tcMar>
               <w:top w:w="60" w:type="dxa"/>
               <w:bottom w:w="60" w:type="dxa"/>
@@ -1585,7 +1656,7 @@
         </w:tc>
         <w:tc>
           <w:tcPr>
-            <w:tcW w:type="dxa" w:w="1419"/>
+            <w:tcW w:type="dxa" w:w="1440"/>
             <w:tcMar>
               <w:top w:w="60" w:type="dxa"/>
               <w:bottom w:w="60" w:type="dxa"/>
@@ -1605,7 +1676,7 @@
         </w:tc>
         <w:tc>
           <w:tcPr>
-            <w:tcW w:type="dxa" w:w="1419"/>
+            <w:tcW w:type="dxa" w:w="1440"/>
             <w:tcMar>
               <w:top w:w="60" w:type="dxa"/>
               <w:bottom w:w="60" w:type="dxa"/>
@@ -1625,7 +1696,7 @@
         </w:tc>
         <w:tc>
           <w:tcPr>
-            <w:tcW w:type="dxa" w:w="1419"/>
+            <w:tcW w:type="dxa" w:w="1440"/>
             <w:tcMar>
               <w:top w:w="60" w:type="dxa"/>
               <w:bottom w:w="60" w:type="dxa"/>
@@ -1645,7 +1716,7 @@
         </w:tc>
         <w:tc>
           <w:tcPr>
-            <w:tcW w:type="dxa" w:w="1419"/>
+            <w:tcW w:type="dxa" w:w="1440"/>
             <w:tcMar>
               <w:top w:w="60" w:type="dxa"/>
               <w:bottom w:w="60" w:type="dxa"/>
@@ -1669,7 +1740,7 @@
         </w:tc>
         <w:tc>
           <w:tcPr>
-            <w:tcW w:type="dxa" w:w="1419"/>
+            <w:tcW w:type="dxa" w:w="1440"/>
             <w:tcMar>
               <w:top w:w="60" w:type="dxa"/>
               <w:bottom w:w="60" w:type="dxa"/>
@@ -1689,7 +1760,7 @@
         </w:tc>
         <w:tc>
           <w:tcPr>
-            <w:tcW w:type="dxa" w:w="1419"/>
+            <w:tcW w:type="dxa" w:w="1440"/>
             <w:tcMar>
               <w:top w:w="60" w:type="dxa"/>
               <w:bottom w:w="60" w:type="dxa"/>
@@ -1713,7 +1784,7 @@
       <w:tr>
         <w:tc>
           <w:tcPr>
-            <w:tcW w:type="dxa" w:w="1419"/>
+            <w:tcW w:type="dxa" w:w="1440"/>
             <w:tcMar>
               <w:top w:w="60" w:type="dxa"/>
               <w:bottom w:w="60" w:type="dxa"/>
@@ -1734,7 +1805,7 @@
         </w:tc>
         <w:tc>
           <w:tcPr>
-            <w:tcW w:type="dxa" w:w="1419"/>
+            <w:tcW w:type="dxa" w:w="1440"/>
             <w:tcMar>
               <w:top w:w="60" w:type="dxa"/>
               <w:bottom w:w="60" w:type="dxa"/>
@@ -1755,7 +1826,7 @@
         </w:tc>
         <w:tc>
           <w:tcPr>
-            <w:tcW w:type="dxa" w:w="1419"/>
+            <w:tcW w:type="dxa" w:w="1440"/>
             <w:tcMar>
               <w:top w:w="60" w:type="dxa"/>
               <w:bottom w:w="60" w:type="dxa"/>
@@ -1776,7 +1847,7 @@
         </w:tc>
         <w:tc>
           <w:tcPr>
-            <w:tcW w:type="dxa" w:w="1419"/>
+            <w:tcW w:type="dxa" w:w="1440"/>
             <w:tcMar>
               <w:top w:w="60" w:type="dxa"/>
               <w:bottom w:w="60" w:type="dxa"/>
@@ -1797,7 +1868,7 @@
         </w:tc>
         <w:tc>
           <w:tcPr>
-            <w:tcW w:type="dxa" w:w="1419"/>
+            <w:tcW w:type="dxa" w:w="1440"/>
             <w:tcMar>
               <w:top w:w="60" w:type="dxa"/>
               <w:bottom w:w="60" w:type="dxa"/>
@@ -1818,7 +1889,7 @@
         </w:tc>
         <w:tc>
           <w:tcPr>
-            <w:tcW w:type="dxa" w:w="1419"/>
+            <w:tcW w:type="dxa" w:w="1440"/>
             <w:tcMar>
               <w:top w:w="60" w:type="dxa"/>
               <w:bottom w:w="60" w:type="dxa"/>
@@ -1839,7 +1910,7 @@
         </w:tc>
         <w:tc>
           <w:tcPr>
-            <w:tcW w:type="dxa" w:w="1419"/>
+            <w:tcW w:type="dxa" w:w="1440"/>
             <w:tcMar>
               <w:top w:w="60" w:type="dxa"/>
               <w:bottom w:w="60" w:type="dxa"/>
@@ -1862,7 +1933,7 @@
       <w:tr>
         <w:tc>
           <w:tcPr>
-            <w:tcW w:type="dxa" w:w="1419"/>
+            <w:tcW w:type="dxa" w:w="1440"/>
             <w:tcMar>
               <w:top w:w="60" w:type="dxa"/>
               <w:bottom w:w="60" w:type="dxa"/>
@@ -1882,7 +1953,7 @@
         </w:tc>
         <w:tc>
           <w:tcPr>
-            <w:tcW w:type="dxa" w:w="1419"/>
+            <w:tcW w:type="dxa" w:w="1440"/>
             <w:tcMar>
               <w:top w:w="60" w:type="dxa"/>
               <w:bottom w:w="60" w:type="dxa"/>
@@ -1902,7 +1973,7 @@
         </w:tc>
         <w:tc>
           <w:tcPr>
-            <w:tcW w:type="dxa" w:w="1419"/>
+            <w:tcW w:type="dxa" w:w="1440"/>
             <w:tcMar>
               <w:top w:w="60" w:type="dxa"/>
               <w:bottom w:w="60" w:type="dxa"/>
@@ -1922,7 +1993,7 @@
         </w:tc>
         <w:tc>
           <w:tcPr>
-            <w:tcW w:type="dxa" w:w="1419"/>
+            <w:tcW w:type="dxa" w:w="1440"/>
             <w:tcMar>
               <w:top w:w="60" w:type="dxa"/>
               <w:bottom w:w="60" w:type="dxa"/>
@@ -1942,7 +2013,7 @@
         </w:tc>
         <w:tc>
           <w:tcPr>
-            <w:tcW w:type="dxa" w:w="1419"/>
+            <w:tcW w:type="dxa" w:w="1440"/>
             <w:tcMar>
               <w:top w:w="60" w:type="dxa"/>
               <w:bottom w:w="60" w:type="dxa"/>
@@ -1966,7 +2037,7 @@
         </w:tc>
         <w:tc>
           <w:tcPr>
-            <w:tcW w:type="dxa" w:w="1419"/>
+            <w:tcW w:type="dxa" w:w="1440"/>
             <w:tcMar>
               <w:top w:w="60" w:type="dxa"/>
               <w:bottom w:w="60" w:type="dxa"/>
@@ -1988,7 +2059,7 @@
         </w:tc>
         <w:tc>
           <w:tcPr>
-            <w:tcW w:type="dxa" w:w="1419"/>
+            <w:tcW w:type="dxa" w:w="1440"/>
             <w:tcMar>
               <w:top w:w="60" w:type="dxa"/>
               <w:bottom w:w="60" w:type="dxa"/>
@@ -2012,7 +2083,7 @@
       <w:tr>
         <w:tc>
           <w:tcPr>
-            <w:tcW w:type="dxa" w:w="1419"/>
+            <w:tcW w:type="dxa" w:w="1440"/>
             <w:tcMar>
               <w:top w:w="60" w:type="dxa"/>
               <w:bottom w:w="60" w:type="dxa"/>
@@ -2033,7 +2104,7 @@
         </w:tc>
         <w:tc>
           <w:tcPr>
-            <w:tcW w:type="dxa" w:w="1419"/>
+            <w:tcW w:type="dxa" w:w="1440"/>
             <w:tcMar>
               <w:top w:w="60" w:type="dxa"/>
               <w:bottom w:w="60" w:type="dxa"/>
@@ -2054,7 +2125,7 @@
         </w:tc>
         <w:tc>
           <w:tcPr>
-            <w:tcW w:type="dxa" w:w="1419"/>
+            <w:tcW w:type="dxa" w:w="1440"/>
             <w:tcMar>
               <w:top w:w="60" w:type="dxa"/>
               <w:bottom w:w="60" w:type="dxa"/>
@@ -2075,7 +2146,7 @@
         </w:tc>
         <w:tc>
           <w:tcPr>
-            <w:tcW w:type="dxa" w:w="1419"/>
+            <w:tcW w:type="dxa" w:w="1440"/>
             <w:tcMar>
               <w:top w:w="60" w:type="dxa"/>
               <w:bottom w:w="60" w:type="dxa"/>
@@ -2096,7 +2167,7 @@
         </w:tc>
         <w:tc>
           <w:tcPr>
-            <w:tcW w:type="dxa" w:w="1419"/>
+            <w:tcW w:type="dxa" w:w="1440"/>
             <w:tcMar>
               <w:top w:w="60" w:type="dxa"/>
               <w:bottom w:w="60" w:type="dxa"/>
@@ -2117,7 +2188,7 @@
         </w:tc>
         <w:tc>
           <w:tcPr>
-            <w:tcW w:type="dxa" w:w="1419"/>
+            <w:tcW w:type="dxa" w:w="1440"/>
             <w:tcMar>
               <w:top w:w="60" w:type="dxa"/>
               <w:bottom w:w="60" w:type="dxa"/>
@@ -2138,7 +2209,7 @@
         </w:tc>
         <w:tc>
           <w:tcPr>
-            <w:tcW w:type="dxa" w:w="1419"/>
+            <w:tcW w:type="dxa" w:w="1440"/>
             <w:tcMar>
               <w:top w:w="60" w:type="dxa"/>
               <w:bottom w:w="60" w:type="dxa"/>
@@ -2163,7 +2234,7 @@
       <w:tr>
         <w:tc>
           <w:tcPr>
-            <w:tcW w:type="dxa" w:w="1419"/>
+            <w:tcW w:type="dxa" w:w="1440"/>
             <w:tcMar>
               <w:top w:w="60" w:type="dxa"/>
               <w:bottom w:w="60" w:type="dxa"/>
@@ -2183,7 +2254,7 @@
         </w:tc>
         <w:tc>
           <w:tcPr>
-            <w:tcW w:type="dxa" w:w="1419"/>
+            <w:tcW w:type="dxa" w:w="1440"/>
             <w:tcMar>
               <w:top w:w="60" w:type="dxa"/>
               <w:bottom w:w="60" w:type="dxa"/>
@@ -2203,7 +2274,7 @@
         </w:tc>
         <w:tc>
           <w:tcPr>
-            <w:tcW w:type="dxa" w:w="1419"/>
+            <w:tcW w:type="dxa" w:w="1440"/>
             <w:tcMar>
               <w:top w:w="60" w:type="dxa"/>
               <w:bottom w:w="60" w:type="dxa"/>
@@ -2223,7 +2294,7 @@
         </w:tc>
         <w:tc>
           <w:tcPr>
-            <w:tcW w:type="dxa" w:w="1419"/>
+            <w:tcW w:type="dxa" w:w="1440"/>
             <w:tcMar>
               <w:top w:w="60" w:type="dxa"/>
               <w:bottom w:w="60" w:type="dxa"/>
@@ -2243,7 +2314,7 @@
         </w:tc>
         <w:tc>
           <w:tcPr>
-            <w:tcW w:type="dxa" w:w="1419"/>
+            <w:tcW w:type="dxa" w:w="1440"/>
             <w:tcMar>
               <w:top w:w="60" w:type="dxa"/>
               <w:bottom w:w="60" w:type="dxa"/>
@@ -2263,7 +2334,7 @@
         </w:tc>
         <w:tc>
           <w:tcPr>
-            <w:tcW w:type="dxa" w:w="1419"/>
+            <w:tcW w:type="dxa" w:w="1440"/>
             <w:tcMar>
               <w:top w:w="60" w:type="dxa"/>
               <w:bottom w:w="60" w:type="dxa"/>
@@ -2285,7 +2356,7 @@
         </w:tc>
         <w:tc>
           <w:tcPr>
-            <w:tcW w:type="dxa" w:w="1419"/>
+            <w:tcW w:type="dxa" w:w="1440"/>
             <w:tcMar>
               <w:top w:w="60" w:type="dxa"/>
               <w:bottom w:w="60" w:type="dxa"/>
@@ -2307,7 +2378,7 @@
       <w:tr>
         <w:tc>
           <w:tcPr>
-            <w:tcW w:type="dxa" w:w="1419"/>
+            <w:tcW w:type="dxa" w:w="1440"/>
             <w:tcMar>
               <w:top w:w="60" w:type="dxa"/>
               <w:bottom w:w="60" w:type="dxa"/>
@@ -2328,7 +2399,7 @@
         </w:tc>
         <w:tc>
           <w:tcPr>
-            <w:tcW w:type="dxa" w:w="1419"/>
+            <w:tcW w:type="dxa" w:w="1440"/>
             <w:tcMar>
               <w:top w:w="60" w:type="dxa"/>
               <w:bottom w:w="60" w:type="dxa"/>
@@ -2349,7 +2420,7 @@
         </w:tc>
         <w:tc>
           <w:tcPr>
-            <w:tcW w:type="dxa" w:w="1419"/>
+            <w:tcW w:type="dxa" w:w="1440"/>
             <w:tcMar>
               <w:top w:w="60" w:type="dxa"/>
               <w:bottom w:w="60" w:type="dxa"/>
@@ -2370,7 +2441,7 @@
         </w:tc>
         <w:tc>
           <w:tcPr>
-            <w:tcW w:type="dxa" w:w="1419"/>
+            <w:tcW w:type="dxa" w:w="1440"/>
             <w:tcMar>
               <w:top w:w="60" w:type="dxa"/>
               <w:bottom w:w="60" w:type="dxa"/>
@@ -2391,7 +2462,7 @@
         </w:tc>
         <w:tc>
           <w:tcPr>
-            <w:tcW w:type="dxa" w:w="1419"/>
+            <w:tcW w:type="dxa" w:w="1440"/>
             <w:tcMar>
               <w:top w:w="60" w:type="dxa"/>
               <w:bottom w:w="60" w:type="dxa"/>
@@ -2414,7 +2485,7 @@
         </w:tc>
         <w:tc>
           <w:tcPr>
-            <w:tcW w:type="dxa" w:w="1419"/>
+            <w:tcW w:type="dxa" w:w="1440"/>
             <w:tcMar>
               <w:top w:w="60" w:type="dxa"/>
               <w:bottom w:w="60" w:type="dxa"/>
@@ -2437,7 +2508,7 @@
         </w:tc>
         <w:tc>
           <w:tcPr>
-            <w:tcW w:type="dxa" w:w="1419"/>
+            <w:tcW w:type="dxa" w:w="1440"/>
             <w:tcMar>
               <w:top w:w="60" w:type="dxa"/>
               <w:bottom w:w="60" w:type="dxa"/>
@@ -2474,7 +2545,7 @@
           <w:rFonts w:ascii="Calibri" w:hAnsi="Calibri"/>
           <w:b/>
           <w:color w:val="0E7490"/>
-          <w:sz w:val="28"/>
+          <w:sz w:val="27"/>
         </w:rPr>
         <w:t>4. Step-by-Step Scenario Showcase Playbook &amp; Screenshot Frames</w:t>
       </w:r>
@@ -2487,7 +2558,7 @@
         <w:rPr>
           <w:rFonts w:ascii="Calibri" w:hAnsi="Calibri"/>
           <w:color w:val="334155"/>
-          <w:sz w:val="20"/>
+          <w:sz w:val="19"/>
         </w:rPr>
         <w:t>This section provides the end-to-end execution walkthrough for each scenario, accompanied by designated screenshot placement frames for capstone defense compilation.</w:t>
       </w:r>
@@ -2514,9 +2585,9 @@
         <w:rPr>
           <w:rFonts w:ascii="Calibri" w:hAnsi="Calibri"/>
           <w:color w:val="334155"/>
-          <w:sz w:val="20"/>
+          <w:sz w:val="19"/>
         </w:rPr>
-        <w:t>Customer Juan Dela Cruz (U1001) transfers PHP 7,500.00 to Maria Santos (U1002). Because the amount is within the retail threshold (&lt;= PHP 50,000.00), the transaction is automatically processed via Straight-Through Processing (STP) per BSP Circular 980 without requiring human management authorization.</w:t>
+        <w:t>Customer Juan Dela Cruz (U1001) transfers PHP 7,500.00 to Maria Santos (U1002). Because the amount is within the retail threshold (&lt;= PHP 50,000.00), the transaction is automatically settled via Straight-Through Processing (STP) per BSP Circular 980 without requiring human management intervention.</w:t>
       </w:r>
     </w:p>
     <w:p>
@@ -2528,7 +2599,7 @@
           <w:rFonts w:ascii="Calibri" w:hAnsi="Calibri"/>
           <w:b/>
           <w:color w:val="0F172A"/>
-          <w:sz w:val="20"/>
+          <w:sz w:val="19"/>
         </w:rPr>
         <w:t xml:space="preserve">• </w:t>
       </w:r>
@@ -2536,9 +2607,9 @@
         <w:rPr>
           <w:rFonts w:ascii="Calibri" w:hAnsi="Calibri"/>
           <w:color w:val="334155"/>
-          <w:sz w:val="20"/>
+          <w:sz w:val="19"/>
         </w:rPr>
-        <w:t>Notification Outputs:</w:t>
+        <w:t>Dual Email Delivery Output:</w:t>
       </w:r>
     </w:p>
     <w:p>
@@ -2550,17 +2621,17 @@
           <w:rFonts w:ascii="Calibri" w:hAnsi="Calibri"/>
           <w:b/>
           <w:color w:val="0F172A"/>
-          <w:sz w:val="20"/>
+          <w:sz w:val="19"/>
         </w:rPr>
-        <w:t xml:space="preserve">1. Email Receipt: </w:t>
+        <w:t xml:space="preserve">1. Sender Debit Advice (Navy Theme): </w:t>
       </w:r>
       <w:r>
         <w:rPr>
           <w:rFonts w:ascii="Calibri" w:hAnsi="Calibri"/>
           <w:color w:val="334155"/>
-          <w:sz w:val="20"/>
+          <w:sz w:val="19"/>
         </w:rPr>
-        <w:t xml:space="preserve"> Juan receives an official HTML receipt in MailHog with masked account numbers (ACC-****8471) and SHA-256 verification hash.</w:t>
+        <w:t xml:space="preserve"> Dispatched to juan.delacruz@retailbank.ph with subject 'Transaction Receipt: ₱7,500.00 [TRX-XXXX]'. Shows masked destination account ACC-****7192, settlement status COMMITTED, remaining available balance, and SHA-256 verification hash.</w:t>
       </w:r>
     </w:p>
     <w:p>
@@ -2572,17 +2643,17 @@
           <w:rFonts w:ascii="Calibri" w:hAnsi="Calibri"/>
           <w:b/>
           <w:color w:val="0F172A"/>
-          <w:sz w:val="20"/>
+          <w:sz w:val="19"/>
         </w:rPr>
-        <w:t xml:space="preserve">2. SSE Browser Toast: </w:t>
+        <w:t xml:space="preserve">2. Beneficiary Inward Credit Advice (Emerald Theme): </w:t>
       </w:r>
       <w:r>
         <w:rPr>
           <w:rFonts w:ascii="Calibri" w:hAnsi="Calibri"/>
           <w:color w:val="334155"/>
-          <w:sz w:val="20"/>
+          <w:sz w:val="19"/>
         </w:rPr>
-        <w:t xml:space="preserve"> Instant green pop-up banner on the client web portal confirming settlement.</w:t>
+        <w:t xml:space="preserve"> Dispatched to maria.santos@retailbank.ph with subject 'Credit Advice: You Received ₱7,500.00 from Juan Dela Cruz [TRX-XXXX]'. Confirms incoming funds credited to ACC-****7192 with status CLEARED &amp; AVAILABLE. The sender's private account balance is completely hidden.</w:t>
       </w:r>
     </w:p>
     <w:p>
@@ -2594,29 +2665,7 @@
           <w:rFonts w:ascii="Calibri" w:hAnsi="Calibri"/>
           <w:b/>
           <w:color w:val="0F172A"/>
-          <w:sz w:val="20"/>
-        </w:rPr>
-        <w:t xml:space="preserve">3. Beneficiary Notice: </w:t>
-      </w:r>
-      <w:r>
-        <w:rPr>
-          <w:rFonts w:ascii="Calibri" w:hAnsi="Calibri"/>
-          <w:color w:val="334155"/>
-          <w:sz w:val="20"/>
-        </w:rPr>
-        <w:t xml:space="preserve"> Maria Santos receives inward credit advice.</w:t>
-      </w:r>
-    </w:p>
-    <w:p>
-      <w:pPr>
-        <w:spacing w:after="60" w:line="276" w:lineRule="auto"/>
-      </w:pPr>
-      <w:r>
-        <w:rPr>
-          <w:rFonts w:ascii="Calibri" w:hAnsi="Calibri"/>
-          <w:b/>
-          <w:color w:val="0F172A"/>
-          <w:sz w:val="20"/>
+          <w:sz w:val="19"/>
         </w:rPr>
         <w:t xml:space="preserve">• </w:t>
       </w:r>
@@ -2624,7 +2673,7 @@
         <w:rPr>
           <w:rFonts w:ascii="Calibri" w:hAnsi="Calibri"/>
           <w:color w:val="334155"/>
-          <w:sz w:val="20"/>
+          <w:sz w:val="19"/>
         </w:rPr>
         <w:t>Run Live Command:</w:t>
       </w:r>
@@ -2636,12 +2685,12 @@
         <w:tblLook w:firstColumn="1" w:firstRow="1" w:lastColumn="0" w:lastRow="0" w:noHBand="0" w:noVBand="1" w:val="04A0"/>
       </w:tblPr>
       <w:tblGrid>
-        <w:gridCol w:w="9936"/>
+        <w:gridCol w:w="10080"/>
       </w:tblGrid>
       <w:tr>
         <w:tc>
           <w:tcPr>
-            <w:tcW w:type="dxa" w:w="9936"/>
+            <w:tcW w:type="dxa" w:w="10080"/>
             <w:shd w:fill="F1F5F9"/>
             <w:tcMar>
               <w:top w:w="80" w:type="dxa"/>
@@ -2678,12 +2727,12 @@
         <w:tblLook w:firstColumn="1" w:firstRow="1" w:lastColumn="0" w:lastRow="0" w:noHBand="0" w:noVBand="1" w:val="04A0"/>
       </w:tblPr>
       <w:tblGrid>
-        <w:gridCol w:w="9936"/>
+        <w:gridCol w:w="10080"/>
       </w:tblGrid>
       <w:tr>
         <w:tc>
           <w:tcPr>
-            <w:tcW w:type="dxa" w:w="9936"/>
+            <w:tcW w:type="dxa" w:w="10080"/>
             <w:shd w:fill="F8FAFC"/>
             <w:tcMar>
               <w:top w:w="160" w:type="dxa"/>
@@ -2720,7 +2769,7 @@
                 <w:color w:val="0F172A"/>
                 <w:sz w:val="21"/>
               </w:rPr>
-              <w:t>Scenario 1: Customer Digital HTML Receipt in MailHog</w:t>
+              <w:t>Scenario 1A: Sender Debit Advice (Juan Dela Cruz) in MailHog</w:t>
               <w:br/>
             </w:r>
             <w:r>
@@ -2730,7 +2779,7 @@
                 <w:color w:val="64748B"/>
                 <w:sz w:val="19"/>
               </w:rPr>
-              <w:t>Suggested View: Screenshot of MailHog Web UI at http://localhost:8025 showing the email with subject 'Transaction Receipt: PHP 25,000.00 [TRX-XXXX]'.</w:t>
+              <w:t>Suggested View: Screenshot of MailHog Web UI at http://localhost:8025 viewing email to Juan Dela Cruz with subject 'Transaction Receipt: ₱7,500.00'.</w:t>
               <w:br/>
             </w:r>
             <w:r>
@@ -2757,7 +2806,7 @@
           <w:color w:val="475569"/>
           <w:sz w:val="18"/>
         </w:rPr>
-        <w:t>Figure: MailHog Inbox view (:8025) displaying Tier 1 Transaction Receipt with SHA-256 Verification Hash</w:t>
+        <w:t>Figure: MailHog Inbox showing Debit Receipt sent to juan.delacruz@retailbank.ph with remaining balance &amp; SHA-256 hash</w:t>
       </w:r>
     </w:p>
     <w:tbl>
@@ -2767,12 +2816,12 @@
         <w:tblLook w:firstColumn="1" w:firstRow="1" w:lastColumn="0" w:lastRow="0" w:noHBand="0" w:noVBand="1" w:val="04A0"/>
       </w:tblPr>
       <w:tblGrid>
-        <w:gridCol w:w="9936"/>
+        <w:gridCol w:w="10080"/>
       </w:tblGrid>
       <w:tr>
         <w:tc>
           <w:tcPr>
-            <w:tcW w:type="dxa" w:w="9936"/>
+            <w:tcW w:type="dxa" w:w="10080"/>
             <w:shd w:fill="F8FAFC"/>
             <w:tcMar>
               <w:top w:w="160" w:type="dxa"/>
@@ -2809,7 +2858,96 @@
                 <w:color w:val="0F172A"/>
                 <w:sz w:val="21"/>
               </w:rPr>
-              <w:t>Scenario 1: Customer Web Portal Instant Settlement Toast</w:t>
+              <w:t>Scenario 1B: Beneficiary Inward Credit Advice (Maria Santos) in MailHog</w:t>
+              <w:br/>
+            </w:r>
+            <w:r>
+              <w:rPr>
+                <w:rFonts w:ascii="Calibri" w:hAnsi="Calibri"/>
+                <w:i/>
+                <w:color w:val="64748B"/>
+                <w:sz w:val="19"/>
+              </w:rPr>
+              <w:t>Suggested View: Screenshot of MailHog Web UI at http://localhost:8025 viewing email to Maria Santos with subject 'Credit Advice: You Received ₱7,500.00 from Juan Dela Cruz'.</w:t>
+              <w:br/>
+            </w:r>
+            <w:r>
+              <w:rPr>
+                <w:rFonts w:ascii="Calibri" w:hAnsi="Calibri"/>
+                <w:color w:val="94A3B8"/>
+                <w:sz w:val="17"/>
+              </w:rPr>
+              <w:t>(Paste your screenshot here in Word. The frame will automatically scale.)</w:t>
+            </w:r>
+          </w:p>
+        </w:tc>
+      </w:tr>
+    </w:tbl>
+    <w:p>
+      <w:pPr>
+        <w:spacing w:before="60" w:after="200"/>
+        <w:jc w:val="center"/>
+      </w:pPr>
+      <w:r>
+        <w:rPr>
+          <w:rFonts w:ascii="Calibri" w:hAnsi="Calibri"/>
+          <w:i/>
+          <w:color w:val="475569"/>
+          <w:sz w:val="18"/>
+        </w:rPr>
+        <w:t>Figure: MailHog Inbox showing Inward Credit Advice sent to maria.santos@retailbank.ph without exposing sender balance</w:t>
+      </w:r>
+    </w:p>
+    <w:tbl>
+      <w:tblPr>
+        <w:tblW w:type="auto" w:w="0"/>
+        <w:jc w:val="center"/>
+        <w:tblLook w:firstColumn="1" w:firstRow="1" w:lastColumn="0" w:lastRow="0" w:noHBand="0" w:noVBand="1" w:val="04A0"/>
+      </w:tblPr>
+      <w:tblGrid>
+        <w:gridCol w:w="10080"/>
+      </w:tblGrid>
+      <w:tr>
+        <w:tc>
+          <w:tcPr>
+            <w:tcW w:type="dxa" w:w="10080"/>
+            <w:shd w:fill="F8FAFC"/>
+            <w:tcMar>
+              <w:top w:w="160" w:type="dxa"/>
+              <w:bottom w:w="160" w:type="dxa"/>
+              <w:left w:w="200" w:type="dxa"/>
+              <w:right w:w="200" w:type="dxa"/>
+            </w:tcMar>
+            <w:tcBorders>
+              <w:top w:val="single" w:sz="8" w:space="0" w:color="94A3B8"/>
+              <w:bottom w:val="single" w:sz="8" w:space="0" w:color="94A3B8"/>
+              <w:left w:val="single" w:sz="8" w:space="0" w:color="94A3B8"/>
+              <w:right w:val="single" w:sz="8" w:space="0" w:color="94A3B8"/>
+            </w:tcBorders>
+          </w:tcPr>
+          <w:p>
+            <w:pPr>
+              <w:spacing w:before="80" w:after="40"/>
+              <w:jc w:val="center"/>
+            </w:pPr>
+            <w:r>
+              <w:rPr>
+                <w:rFonts w:ascii="Calibri" w:hAnsi="Calibri"/>
+                <w:b/>
+                <w:color w:val="0E7490"/>
+                <w:sz w:val="22"/>
+              </w:rPr>
+              <w:t>📷 [SCREENSHOT PLACEHOLDER]</w:t>
+              <w:br/>
+            </w:r>
+            <w:r>
+              <w:rPr>
+                <w:rFonts w:ascii="Calibri" w:hAnsi="Calibri"/>
+                <w:b/>
+                <w:color w:val="0F172A"/>
+                <w:sz w:val="21"/>
+              </w:rPr>
+              <w:t>Scenario 1C: Customer Web Portal Instant Settlement Toast Notification</w:t>
               <w:br/>
             </w:r>
             <w:r>
@@ -2846,7 +2984,7 @@
           <w:color w:val="475569"/>
           <w:sz w:val="18"/>
         </w:rPr>
-        <w:t>Figure: Customer Portal (:3000) showing green execution toast notification</w:t>
+        <w:t>Figure: Customer Portal (:3000) displaying active green settlement toast banner</w:t>
       </w:r>
     </w:p>
     <w:p>
@@ -2871,7 +3009,7 @@
         <w:rPr>
           <w:rFonts w:ascii="Calibri" w:hAnsi="Calibri"/>
           <w:color w:val="334155"/>
-          <w:sz w:val="20"/>
+          <w:sz w:val="19"/>
         </w:rPr>
         <w:t>Customer Juan Dela Cruz (Maker) transfers PHP 150,000.00. Because the amount exceeds the retail limit (PHP 50,000.01 – PHP 499,999.99), the system places the transfer on HOLD (PENDING_APPROVAL) per BSP MORB Section 146. Available balance is decremented to prevent double-spending, while the ledger awaits authorization from Bank Operations Manager Beatriz Ocampo (U3002).</w:t>
       </w:r>
@@ -2885,7 +3023,7 @@
           <w:rFonts w:ascii="Calibri" w:hAnsi="Calibri"/>
           <w:b/>
           <w:color w:val="0F172A"/>
-          <w:sz w:val="20"/>
+          <w:sz w:val="19"/>
         </w:rPr>
         <w:t xml:space="preserve">• </w:t>
       </w:r>
@@ -2893,7 +3031,7 @@
         <w:rPr>
           <w:rFonts w:ascii="Calibri" w:hAnsi="Calibri"/>
           <w:color w:val="334155"/>
-          <w:sz w:val="20"/>
+          <w:sz w:val="19"/>
         </w:rPr>
         <w:t>Notification Outputs:</w:t>
       </w:r>
@@ -2907,7 +3045,7 @@
           <w:rFonts w:ascii="Calibri" w:hAnsi="Calibri"/>
           <w:b/>
           <w:color w:val="0F172A"/>
-          <w:sz w:val="20"/>
+          <w:sz w:val="19"/>
         </w:rPr>
         <w:t xml:space="preserve">1. WebSocket Alert: </w:t>
       </w:r>
@@ -2915,7 +3053,7 @@
         <w:rPr>
           <w:rFonts w:ascii="Calibri" w:hAnsi="Calibri"/>
           <w:color w:val="334155"/>
-          <w:sz w:val="20"/>
+          <w:sz w:val="19"/>
         </w:rPr>
         <w:t xml:space="preserve"> Flashing real-time pop-up alert pushed to the Manager Console at /topic/manager-alerts.</w:t>
       </w:r>
@@ -2929,7 +3067,7 @@
           <w:rFonts w:ascii="Calibri" w:hAnsi="Calibri"/>
           <w:b/>
           <w:color w:val="0F172A"/>
-          <w:sz w:val="20"/>
+          <w:sz w:val="19"/>
         </w:rPr>
         <w:t xml:space="preserve">2. Manager Action Email: </w:t>
       </w:r>
@@ -2937,7 +3075,7 @@
         <w:rPr>
           <w:rFonts w:ascii="Calibri" w:hAnsi="Calibri"/>
           <w:color w:val="334155"/>
-          <w:sz w:val="20"/>
+          <w:sz w:val="19"/>
         </w:rPr>
         <w:t xml:space="preserve"> High-priority review email dispatched to Beatriz Ocampo with one-click authorization links.</w:t>
       </w:r>
@@ -2951,7 +3089,7 @@
           <w:rFonts w:ascii="Calibri" w:hAnsi="Calibri"/>
           <w:b/>
           <w:color w:val="0F172A"/>
-          <w:sz w:val="20"/>
+          <w:sz w:val="19"/>
         </w:rPr>
         <w:t xml:space="preserve">3. Customer Hold Notice: </w:t>
       </w:r>
@@ -2959,7 +3097,7 @@
         <w:rPr>
           <w:rFonts w:ascii="Calibri" w:hAnsi="Calibri"/>
           <w:color w:val="334155"/>
-          <w:sz w:val="20"/>
+          <w:sz w:val="19"/>
         </w:rPr>
         <w:t xml:space="preserve"> Juan receives an advisory email that his transfer is held for dual-control review.</w:t>
       </w:r>
@@ -2973,7 +3111,7 @@
           <w:rFonts w:ascii="Calibri" w:hAnsi="Calibri"/>
           <w:b/>
           <w:color w:val="0F172A"/>
-          <w:sz w:val="20"/>
+          <w:sz w:val="19"/>
         </w:rPr>
         <w:t xml:space="preserve">• </w:t>
       </w:r>
@@ -2981,7 +3119,7 @@
         <w:rPr>
           <w:rFonts w:ascii="Calibri" w:hAnsi="Calibri"/>
           <w:color w:val="334155"/>
-          <w:sz w:val="20"/>
+          <w:sz w:val="19"/>
         </w:rPr>
         <w:t>Run Live Command:</w:t>
       </w:r>
@@ -2993,12 +3131,12 @@
         <w:tblLook w:firstColumn="1" w:firstRow="1" w:lastColumn="0" w:lastRow="0" w:noHBand="0" w:noVBand="1" w:val="04A0"/>
       </w:tblPr>
       <w:tblGrid>
-        <w:gridCol w:w="9936"/>
+        <w:gridCol w:w="10080"/>
       </w:tblGrid>
       <w:tr>
         <w:tc>
           <w:tcPr>
-            <w:tcW w:type="dxa" w:w="9936"/>
+            <w:tcW w:type="dxa" w:w="10080"/>
             <w:shd w:fill="F1F5F9"/>
             <w:tcMar>
               <w:top w:w="80" w:type="dxa"/>
@@ -3035,12 +3173,12 @@
         <w:tblLook w:firstColumn="1" w:firstRow="1" w:lastColumn="0" w:lastRow="0" w:noHBand="0" w:noVBand="1" w:val="04A0"/>
       </w:tblPr>
       <w:tblGrid>
-        <w:gridCol w:w="9936"/>
+        <w:gridCol w:w="10080"/>
       </w:tblGrid>
       <w:tr>
         <w:tc>
           <w:tcPr>
-            <w:tcW w:type="dxa" w:w="9936"/>
+            <w:tcW w:type="dxa" w:w="10080"/>
             <w:shd w:fill="F8FAFC"/>
             <w:tcMar>
               <w:top w:w="160" w:type="dxa"/>
@@ -3077,7 +3215,7 @@
                 <w:color w:val="0F172A"/>
                 <w:sz w:val="21"/>
               </w:rPr>
-              <w:t>Scenario 2: Manager Console Flashing WebSocket Alert Banner</w:t>
+              <w:t>Scenario 2A: Manager Console Flashing WebSocket Alert Banner</w:t>
               <w:br/>
             </w:r>
             <w:r>
@@ -3124,12 +3262,12 @@
         <w:tblLook w:firstColumn="1" w:firstRow="1" w:lastColumn="0" w:lastRow="0" w:noHBand="0" w:noVBand="1" w:val="04A0"/>
       </w:tblPr>
       <w:tblGrid>
-        <w:gridCol w:w="9936"/>
+        <w:gridCol w:w="10080"/>
       </w:tblGrid>
       <w:tr>
         <w:tc>
           <w:tcPr>
-            <w:tcW w:type="dxa" w:w="9936"/>
+            <w:tcW w:type="dxa" w:w="10080"/>
             <w:shd w:fill="F8FAFC"/>
             <w:tcMar>
               <w:top w:w="160" w:type="dxa"/>
@@ -3166,7 +3304,7 @@
                 <w:color w:val="0F172A"/>
                 <w:sz w:val="21"/>
               </w:rPr>
-              <w:t>Scenario 2: Dual Control Action Email in MailHog</w:t>
+              <w:t>Scenario 2B: Dual Control Action Email in MailHog</w:t>
               <w:br/>
             </w:r>
             <w:r>
@@ -3228,7 +3366,7 @@
         <w:rPr>
           <w:rFonts w:ascii="Calibri" w:hAnsi="Calibri"/>
           <w:color w:val="334155"/>
-          <w:sz w:val="20"/>
+          <w:sz w:val="19"/>
         </w:rPr>
         <w:t>When Manager Beatriz Ocampo (U3002) reviews the transfer in the Manager Console:</w:t>
       </w:r>
@@ -3242,7 +3380,7 @@
           <w:rFonts w:ascii="Calibri" w:hAnsi="Calibri"/>
           <w:b/>
           <w:color w:val="0F172A"/>
-          <w:sz w:val="20"/>
+          <w:sz w:val="19"/>
         </w:rPr>
         <w:t xml:space="preserve">• On Approval: </w:t>
       </w:r>
@@ -3250,7 +3388,7 @@
         <w:rPr>
           <w:rFonts w:ascii="Calibri" w:hAnsi="Calibri"/>
           <w:color w:val="334155"/>
-          <w:sz w:val="20"/>
+          <w:sz w:val="19"/>
         </w:rPr>
         <w:t xml:space="preserve"> The ledger mutates the balance permanently, writes an immutable audit record to PostgreSQL, and dispatches final debit/credit receipts to Juan and Maria.</w:t>
       </w:r>
@@ -3264,7 +3402,7 @@
           <w:rFonts w:ascii="Calibri" w:hAnsi="Calibri"/>
           <w:b/>
           <w:color w:val="0F172A"/>
-          <w:sz w:val="20"/>
+          <w:sz w:val="19"/>
         </w:rPr>
         <w:t xml:space="preserve">• On Rejection: </w:t>
       </w:r>
@@ -3272,7 +3410,7 @@
         <w:rPr>
           <w:rFonts w:ascii="Calibri" w:hAnsi="Calibri"/>
           <w:color w:val="334155"/>
-          <w:sz w:val="20"/>
+          <w:sz w:val="19"/>
         </w:rPr>
         <w:t xml:space="preserve"> The ledger restores Juan's available balance, logs the cancellation reason, and dispatches a Disapproval Notice explaining why the transaction was voided per BSP Circular 1033.</w:t>
       </w:r>
@@ -3284,12 +3422,12 @@
         <w:tblLook w:firstColumn="1" w:firstRow="1" w:lastColumn="0" w:lastRow="0" w:noHBand="0" w:noVBand="1" w:val="04A0"/>
       </w:tblPr>
       <w:tblGrid>
-        <w:gridCol w:w="9936"/>
+        <w:gridCol w:w="10080"/>
       </w:tblGrid>
       <w:tr>
         <w:tc>
           <w:tcPr>
-            <w:tcW w:type="dxa" w:w="9936"/>
+            <w:tcW w:type="dxa" w:w="10080"/>
             <w:shd w:fill="F8FAFC"/>
             <w:tcMar>
               <w:top w:w="160" w:type="dxa"/>
@@ -3388,7 +3526,7 @@
         <w:rPr>
           <w:rFonts w:ascii="Calibri" w:hAnsi="Calibri"/>
           <w:color w:val="334155"/>
-          <w:sz w:val="20"/>
+          <w:sz w:val="19"/>
         </w:rPr>
         <w:t>Customer Juan Dela Cruz transfers PHP 750,000.00. Under Republic Act 9160 (AMLA Section 3b) and BSP Circular 1022, amounts &gt;= PHP 500,000.00 trigger mandatory Covered Transaction Reporting (CTR) and require Dual Management Sign-off (Manager 1 + Senior Manager 2) before funds can be released.</w:t>
       </w:r>
@@ -3402,7 +3540,7 @@
           <w:rFonts w:ascii="Calibri" w:hAnsi="Calibri"/>
           <w:b/>
           <w:color w:val="0F172A"/>
-          <w:sz w:val="20"/>
+          <w:sz w:val="19"/>
         </w:rPr>
         <w:t xml:space="preserve">• </w:t>
       </w:r>
@@ -3410,7 +3548,7 @@
         <w:rPr>
           <w:rFonts w:ascii="Calibri" w:hAnsi="Calibri"/>
           <w:color w:val="334155"/>
-          <w:sz w:val="20"/>
+          <w:sz w:val="19"/>
         </w:rPr>
         <w:t>Two-Stage Authorization Protocol:</w:t>
       </w:r>
@@ -3424,7 +3562,7 @@
           <w:rFonts w:ascii="Calibri" w:hAnsi="Calibri"/>
           <w:b/>
           <w:color w:val="0F172A"/>
-          <w:sz w:val="20"/>
+          <w:sz w:val="19"/>
         </w:rPr>
         <w:t xml:space="preserve">1. Level 1 Review: </w:t>
       </w:r>
@@ -3432,7 +3570,7 @@
         <w:rPr>
           <w:rFonts w:ascii="Calibri" w:hAnsi="Calibri"/>
           <w:color w:val="334155"/>
-          <w:sz w:val="20"/>
+          <w:sz w:val="19"/>
         </w:rPr>
         <w:t xml:space="preserve"> Manager Beatriz Ocampo (U3002) inspects KYC and verifies source of wealth, then signs off as Level 1 Reviewer. The transaction advances to AMLA_CTR_PENDING_LEVEL2.</w:t>
       </w:r>
@@ -3446,7 +3584,7 @@
           <w:rFonts w:ascii="Calibri" w:hAnsi="Calibri"/>
           <w:b/>
           <w:color w:val="0F172A"/>
-          <w:sz w:val="20"/>
+          <w:sz w:val="19"/>
         </w:rPr>
         <w:t xml:space="preserve">2. Escalation Alert: </w:t>
       </w:r>
@@ -3454,7 +3592,7 @@
         <w:rPr>
           <w:rFonts w:ascii="Calibri" w:hAnsi="Calibri"/>
           <w:color w:val="334155"/>
-          <w:sz w:val="20"/>
+          <w:sz w:val="19"/>
         </w:rPr>
         <w:t xml:space="preserve"> Notification Service escalates the transfer to Senior Manager Carlos Mendoza (U3003) via dedicated alert.</w:t>
       </w:r>
@@ -3468,7 +3606,7 @@
           <w:rFonts w:ascii="Calibri" w:hAnsi="Calibri"/>
           <w:b/>
           <w:color w:val="0F172A"/>
-          <w:sz w:val="20"/>
+          <w:sz w:val="19"/>
         </w:rPr>
         <w:t xml:space="preserve">3. Level 2 Sign-Off: </w:t>
       </w:r>
@@ -3476,7 +3614,7 @@
         <w:rPr>
           <w:rFonts w:ascii="Calibri" w:hAnsi="Calibri"/>
           <w:color w:val="334155"/>
-          <w:sz w:val="20"/>
+          <w:sz w:val="19"/>
         </w:rPr>
         <w:t xml:space="preserve"> Senior Manager Carlos Mendoza (U3003) executes final authorization. Balance is debited, CTR report is flagged for AMLC submission within 5 banking days, and dual-signed receipts are dispatched.</w:t>
       </w:r>
@@ -3490,7 +3628,7 @@
           <w:rFonts w:ascii="Calibri" w:hAnsi="Calibri"/>
           <w:b/>
           <w:color w:val="0F172A"/>
-          <w:sz w:val="20"/>
+          <w:sz w:val="19"/>
         </w:rPr>
         <w:t xml:space="preserve">• </w:t>
       </w:r>
@@ -3498,7 +3636,7 @@
         <w:rPr>
           <w:rFonts w:ascii="Calibri" w:hAnsi="Calibri"/>
           <w:color w:val="334155"/>
-          <w:sz w:val="20"/>
+          <w:sz w:val="19"/>
         </w:rPr>
         <w:t>Run Live Command:</w:t>
       </w:r>
@@ -3510,12 +3648,12 @@
         <w:tblLook w:firstColumn="1" w:firstRow="1" w:lastColumn="0" w:lastRow="0" w:noHBand="0" w:noVBand="1" w:val="04A0"/>
       </w:tblPr>
       <w:tblGrid>
-        <w:gridCol w:w="9936"/>
+        <w:gridCol w:w="10080"/>
       </w:tblGrid>
       <w:tr>
         <w:tc>
           <w:tcPr>
-            <w:tcW w:type="dxa" w:w="9936"/>
+            <w:tcW w:type="dxa" w:w="10080"/>
             <w:shd w:fill="F1F5F9"/>
             <w:tcMar>
               <w:top w:w="80" w:type="dxa"/>
@@ -3552,12 +3690,12 @@
         <w:tblLook w:firstColumn="1" w:firstRow="1" w:lastColumn="0" w:lastRow="0" w:noHBand="0" w:noVBand="1" w:val="04A0"/>
       </w:tblPr>
       <w:tblGrid>
-        <w:gridCol w:w="9936"/>
+        <w:gridCol w:w="10080"/>
       </w:tblGrid>
       <w:tr>
         <w:tc>
           <w:tcPr>
-            <w:tcW w:type="dxa" w:w="9936"/>
+            <w:tcW w:type="dxa" w:w="10080"/>
             <w:shd w:fill="F8FAFC"/>
             <w:tcMar>
               <w:top w:w="160" w:type="dxa"/>
@@ -3641,12 +3779,12 @@
         <w:tblLook w:firstColumn="1" w:firstRow="1" w:lastColumn="0" w:lastRow="0" w:noHBand="0" w:noVBand="1" w:val="04A0"/>
       </w:tblPr>
       <w:tblGrid>
-        <w:gridCol w:w="9936"/>
+        <w:gridCol w:w="10080"/>
       </w:tblGrid>
       <w:tr>
         <w:tc>
           <w:tcPr>
-            <w:tcW w:type="dxa" w:w="9936"/>
+            <w:tcW w:type="dxa" w:w="10080"/>
             <w:shd w:fill="F8FAFC"/>
             <w:tcMar>
               <w:top w:w="160" w:type="dxa"/>
@@ -3745,7 +3883,7 @@
         <w:rPr>
           <w:rFonts w:ascii="Calibri" w:hAnsi="Calibri"/>
           <w:color w:val="334155"/>
-          <w:sz w:val="20"/>
+          <w:sz w:val="19"/>
         </w:rPr>
         <w:t>To protect against network replays and service outages, the Notification Service implements enterprise-grade resiliency:</w:t>
       </w:r>
@@ -3759,7 +3897,7 @@
           <w:rFonts w:ascii="Calibri" w:hAnsi="Calibri"/>
           <w:b/>
           <w:color w:val="0F172A"/>
-          <w:sz w:val="20"/>
+          <w:sz w:val="19"/>
         </w:rPr>
         <w:t xml:space="preserve">• Redis Deduplication (Anti-Spam): </w:t>
       </w:r>
@@ -3767,7 +3905,7 @@
         <w:rPr>
           <w:rFonts w:ascii="Calibri" w:hAnsi="Calibri"/>
           <w:color w:val="334155"/>
-          <w:sz w:val="20"/>
+          <w:sz w:val="19"/>
         </w:rPr>
         <w:t xml:space="preserve"> Redis SETNX EX 3600 drops duplicate transfer events within 1 hour. If a customer double-clicks, exactly 1 email is sent.</w:t>
       </w:r>
@@ -3781,7 +3919,7 @@
           <w:rFonts w:ascii="Calibri" w:hAnsi="Calibri"/>
           <w:b/>
           <w:color w:val="0F172A"/>
-          <w:sz w:val="20"/>
+          <w:sz w:val="19"/>
         </w:rPr>
         <w:t xml:space="preserve">• Circuit Breaker &amp; Retry Spool: </w:t>
       </w:r>
@@ -3789,7 +3927,7 @@
         <w:rPr>
           <w:rFonts w:ascii="Calibri" w:hAnsi="Calibri"/>
           <w:color w:val="334155"/>
-          <w:sz w:val="20"/>
+          <w:sz w:val="19"/>
         </w:rPr>
         <w:t xml:space="preserve"> If downstream SMTP fails, the internal circuit flips to OPEN, buffering emails in an in-memory queue. Once SMTP recovers, /flush-spool flushes all unsent receipts without data loss.</w:t>
       </w:r>
@@ -3803,7 +3941,7 @@
           <w:rFonts w:ascii="Calibri" w:hAnsi="Calibri"/>
           <w:b/>
           <w:color w:val="0F172A"/>
-          <w:sz w:val="20"/>
+          <w:sz w:val="19"/>
         </w:rPr>
         <w:t xml:space="preserve">• </w:t>
       </w:r>
@@ -3811,7 +3949,7 @@
         <w:rPr>
           <w:rFonts w:ascii="Calibri" w:hAnsi="Calibri"/>
           <w:color w:val="334155"/>
-          <w:sz w:val="20"/>
+          <w:sz w:val="19"/>
         </w:rPr>
         <w:t>Telemetry Endpoints:</w:t>
       </w:r>
@@ -3823,12 +3961,12 @@
         <w:tblLook w:firstColumn="1" w:firstRow="1" w:lastColumn="0" w:lastRow="0" w:noHBand="0" w:noVBand="1" w:val="04A0"/>
       </w:tblPr>
       <w:tblGrid>
-        <w:gridCol w:w="9936"/>
+        <w:gridCol w:w="10080"/>
       </w:tblGrid>
       <w:tr>
         <w:tc>
           <w:tcPr>
-            <w:tcW w:type="dxa" w:w="9936"/>
+            <w:tcW w:type="dxa" w:w="10080"/>
             <w:shd w:fill="F1F5F9"/>
             <w:tcMar>
               <w:top w:w="80" w:type="dxa"/>
@@ -3867,12 +4005,12 @@
         <w:tblLook w:firstColumn="1" w:firstRow="1" w:lastColumn="0" w:lastRow="0" w:noHBand="0" w:noVBand="1" w:val="04A0"/>
       </w:tblPr>
       <w:tblGrid>
-        <w:gridCol w:w="9936"/>
+        <w:gridCol w:w="10080"/>
       </w:tblGrid>
       <w:tr>
         <w:tc>
           <w:tcPr>
-            <w:tcW w:type="dxa" w:w="9936"/>
+            <w:tcW w:type="dxa" w:w="10080"/>
             <w:shd w:fill="F8FAFC"/>
             <w:tcMar>
               <w:top w:w="160" w:type="dxa"/>
@@ -3958,7 +4096,7 @@
           <w:rFonts w:ascii="Calibri" w:hAnsi="Calibri"/>
           <w:b/>
           <w:color w:val="0E7490"/>
-          <w:sz w:val="28"/>
+          <w:sz w:val="27"/>
         </w:rPr>
         <w:t>5. Cryptographic Receipt Verification Formula (Non-Repudiation)</w:t>
       </w:r>
@@ -3971,7 +4109,7 @@
         <w:rPr>
           <w:rFonts w:ascii="Calibri" w:hAnsi="Calibri"/>
           <w:color w:val="334155"/>
-          <w:sz w:val="20"/>
+          <w:sz w:val="19"/>
         </w:rPr>
         <w:t>Every digital receipt issued by the Notification Service includes an immutable SHA-256 HMAC digest computed across four deterministic fields:</w:t>
       </w:r>
@@ -3983,12 +4121,12 @@
         <w:tblLook w:firstColumn="1" w:firstRow="1" w:lastColumn="0" w:lastRow="0" w:noHBand="0" w:noVBand="1" w:val="04A0"/>
       </w:tblPr>
       <w:tblGrid>
-        <w:gridCol w:w="9936"/>
+        <w:gridCol w:w="10080"/>
       </w:tblGrid>
       <w:tr>
         <w:tc>
           <w:tcPr>
-            <w:tcW w:type="dxa" w:w="9936"/>
+            <w:tcW w:type="dxa" w:w="10080"/>
             <w:shd w:fill="F1F5F9"/>
             <w:tcMar>
               <w:top w:w="80" w:type="dxa"/>
@@ -4026,14 +4164,14 @@
         <w:rPr>
           <w:rFonts w:ascii="Calibri" w:hAnsi="Calibri"/>
           <w:color w:val="334155"/>
-          <w:sz w:val="20"/>
+          <w:sz w:val="19"/>
         </w:rPr>
         <w:t>This guarantees non-repudiation and complies with BSP Circular 1033 Section 5, ensuring that neither the customer nor the bank can alter the recorded financial settlement terms after receipt generation.</w:t>
       </w:r>
     </w:p>
     <w:sectPr>
       <w:pgSz w:w="12240" w:h="15840"/>
-      <w:pgMar w:top="1152" w:right="1152" w:bottom="1152" w:left="1152" w:header="720" w:footer="720" w:gutter="0"/>
+      <w:pgMar w:top="1080" w:right="1080" w:bottom="1080" w:left="1080" w:header="720" w:footer="720" w:gutter="0"/>
       <w:cols w:space="720"/>
       <w:docGrid w:linePitch="360"/>
     </w:sectPr>

</xml_diff>